<commit_message>
docs: set candidate name to Anshu Kumar, remove figures count and submission date across all documents
</commit_message>
<xml_diff>
--- a/submission_files/01_Project_Synopsis_Petrochemical_Trade_Analytics.docx
+++ b/submission_files/01_Project_Synopsis_Petrochemical_Trade_Analytics.docx
@@ -147,7 +147,7 @@
                 <w:b/>
                 <w:sz w:val="19"/>
               </w:rPr>
-              <w:t>Candidate Name &amp; ID:</w:t>
+              <w:t>Candidate Name:</w:t>
             </w:r>
           </w:p>
         </w:tc>
@@ -161,7 +161,7 @@
                 <w:rFonts w:ascii="Arial" w:hAnsi="Arial"/>
                 <w:sz w:val="19"/>
               </w:rPr>
-              <w:t>[Student Full Name] | LMS ID: [Student Roll / LMS ID]</w:t>
+              <w:t>Anshu Kumar</w:t>
             </w:r>
           </w:p>
         </w:tc>
@@ -193,37 +193,6 @@
                 <w:sz w:val="19"/>
               </w:rPr>
               <w:t>2015 - 2024 (10 Years) | UN Comtrade Official Database</w:t>
-            </w:r>
-          </w:p>
-        </w:tc>
-      </w:tr>
-      <w:tr>
-        <w:tc>
-          <w:tcPr>
-            <w:tcW w:type="dxa" w:w="4680"/>
-          </w:tcPr>
-          <w:p>
-            <w:r>
-              <w:rPr>
-                <w:rFonts w:ascii="Arial" w:hAnsi="Arial"/>
-                <w:b/>
-                <w:sz w:val="19"/>
-              </w:rPr>
-              <w:t>Submission Deadline:</w:t>
-            </w:r>
-          </w:p>
-        </w:tc>
-        <w:tc>
-          <w:tcPr>
-            <w:tcW w:type="dxa" w:w="4680"/>
-          </w:tcPr>
-          <w:p>
-            <w:r>
-              <w:rPr>
-                <w:rFonts w:ascii="Arial" w:hAnsi="Arial"/>
-                <w:sz w:val="19"/>
-              </w:rPr>
-              <w:t>1st November 2026, 6:00 PM</w:t>
             </w:r>
           </w:p>
         </w:tc>

</xml_diff>